<commit_message>
Working on research paper reading
</commit_message>
<xml_diff>
--- a/supplemental/papers/Summary of Research Papers.docx
+++ b/supplemental/papers/Summary of Research Papers.docx
@@ -6265,12 +6265,55 @@
       </w:r>
     </w:p>
     <w:p>
+      <w:r>
+        <w:br w:type="page"/>
+      </w:r>
+    </w:p>
+    <w:p>
+      <w:pPr>
+        <w:pStyle w:val="Heading2"/>
+        <w:rPr>
+          <w:color w:val="auto"/>
+        </w:rPr>
+      </w:pPr>
+      <w:r>
+        <w:rPr>
+          <w:color w:val="auto"/>
+        </w:rPr>
+        <w:lastRenderedPageBreak/>
+        <w:t>[58] Dynamically Exploiting Narrow Width Operands to Improve Processor Power and Performance</w:t>
+      </w:r>
+    </w:p>
+    <w:p>
+      <w:r>
+        <w:rPr>
+          <w:b/>
+          <w:bCs/>
+        </w:rPr>
+        <w:t xml:space="preserve">Problem or Purpose: </w:t>
+      </w:r>
+      <w:r>
+        <w:t>This paper explores “narrow width operand” detection to watch for small operand values and not use every signal using clock gating as well as doing multiple calculation on a single ALU to reduce power consumption per instruction.</w:t>
+      </w:r>
+    </w:p>
+    <w:p>
+      <w:r>
+        <w:rPr>
+          <w:b/>
+          <w:bCs/>
+        </w:rPr>
+        <w:t>Key Contributions</w:t>
+      </w:r>
+      <w:r>
+        <w:t xml:space="preserve">: </w:t>
+      </w:r>
+    </w:p>
+    <w:p>
       <w:pPr>
         <w:pStyle w:val="Heading1"/>
       </w:pPr>
       <w:bookmarkStart w:id="30" w:name="_Toc228830084"/>
       <w:r>
-        <w:lastRenderedPageBreak/>
         <w:t>Reconfigurable Computing</w:t>
       </w:r>
       <w:bookmarkEnd w:id="30"/>
@@ -6391,7 +6434,11 @@
     <w:p>
       <w:r>
         <w:tab/>
-        <w:t>There exist three main time periods that FPGA development has gone through: The Age of Invention (1984 – 1991), the Age of Expansion (1992 – 1999), and the Age of Accumulation (2000 – 2007). The Age of Invention was characterized by manual design due to the limited routing resources on chips, EDA development for the devices, and a low up-front cost of using FPGAs. In the Age of Invention, FPGAs were smaller than the applications wanted for them. The Age of Expansion was characterized by Moore’s Law having rapidly increased the capacity of FPGAs. There was a demand for design automation and longer interconnection segmentation. Lastly, the Age of Accumulation was characterized by FPGAs focusing on the communications industry. FPGAs became so customizable and had so many features that certain features were not needed and were pointless, causing a shift away from FPGAs. In the Age of Accumulation, power improved, but there was a tradeoff with performance. Now, FPGAs are collections of block with programmable logic. FPGAs are full programmable system-on-a-chip and are software programmable and hardware programmable.</w:t>
+        <w:t xml:space="preserve">There exist three main time periods that FPGA development has gone through: The Age of Invention (1984 – 1991), the Age of Expansion (1992 – 1999), and the Age of Accumulation (2000 – 2007). The Age of Invention was characterized by manual design due to the limited routing resources on chips, EDA development for the devices, and a low up-front cost of using FPGAs. In the Age of Invention, FPGAs were smaller than the applications wanted for them. The Age of Expansion was characterized by Moore’s Law having rapidly increased the capacity of FPGAs. There was a demand for design automation and longer interconnection segmentation. Lastly, the Age of Accumulation was </w:t>
+      </w:r>
+      <w:r>
+        <w:lastRenderedPageBreak/>
+        <w:t>characterized by FPGAs focusing on the communications industry. FPGAs became so customizable and had so many features that certain features were not needed and were pointless, causing a shift away from FPGAs. In the Age of Accumulation, power improved, but there was a tradeoff with performance. Now, FPGAs are collections of block with programmable logic. FPGAs are full programmable system-on-a-chip and are software programmable and hardware programmable.</w:t>
       </w:r>
     </w:p>
     <w:p>
@@ -6406,7 +6453,6 @@
         <w:rPr>
           <w:color w:val="auto"/>
         </w:rPr>
-        <w:lastRenderedPageBreak/>
         <w:t>[26] FPGA Dynamic and Partial Reconfiguration: A Survey</w:t>
       </w:r>
       <w:bookmarkEnd w:id="33"/>
@@ -6568,6 +6614,7 @@
           <w:b/>
           <w:bCs/>
         </w:rPr>
+        <w:lastRenderedPageBreak/>
         <w:t xml:space="preserve">Use for Report: </w:t>
       </w:r>
       <w:r>
@@ -6598,7 +6645,6 @@
         <w:rPr>
           <w:color w:val="auto"/>
         </w:rPr>
-        <w:lastRenderedPageBreak/>
         <w:t>[45] Dynamic and Partial Reconfiguration of FPGAs</w:t>
       </w:r>
       <w:bookmarkEnd w:id="35"/>
@@ -6799,6 +6845,7 @@
         </w:numPr>
       </w:pPr>
       <w:r>
+        <w:lastRenderedPageBreak/>
         <w:t>Demonstrates that high-level power simulation can be over 1000x faster than layout-level tools while maintaining accuracy within 10% of industry-standard estimates.</w:t>
       </w:r>
     </w:p>
@@ -6820,7 +6867,6 @@
           <w:b/>
           <w:bCs/>
         </w:rPr>
-        <w:lastRenderedPageBreak/>
         <w:t xml:space="preserve">Limitations: </w:t>
       </w:r>
       <w:r>
@@ -7069,6 +7115,7 @@
         </w:numPr>
       </w:pPr>
       <w:r>
+        <w:lastRenderedPageBreak/>
         <w:t>Utilizes an active learning sampling algorithm to significantly reduce the computational cost and time required to generate accurate power labels for new architectures.</w:t>
       </w:r>
     </w:p>
@@ -7078,7 +7125,6 @@
           <w:b/>
           <w:bCs/>
         </w:rPr>
-        <w:lastRenderedPageBreak/>
         <w:t>Use for Report:</w:t>
       </w:r>
       <w:r>
@@ -7277,6 +7323,7 @@
         </w:numPr>
       </w:pPr>
       <w:r>
+        <w:lastRenderedPageBreak/>
         <w:t xml:space="preserve">Develops a physics-based analytical framework that models the latency and energy dissipation of critical cache components, including decoders, </w:t>
       </w:r>
       <w:proofErr w:type="spellStart"/>
@@ -7305,7 +7352,6 @@
         </w:numPr>
       </w:pPr>
       <w:r>
-        <w:lastRenderedPageBreak/>
         <w:t>Enables rapid architectural</w:t>
       </w:r>
       <w:r>
@@ -7490,6 +7536,7 @@
         </w:numPr>
       </w:pPr>
       <w:r>
+        <w:lastRenderedPageBreak/>
         <w:t>Provides a multi-ISA infrastructure (supporting x86, ARM, RISC-V, and more) with a flexible object-oriented design that allows for the easy swapping of CPU models and memory hierarchies.</w:t>
       </w:r>
     </w:p>
@@ -7511,7 +7558,6 @@
           <w:b/>
           <w:bCs/>
         </w:rPr>
-        <w:lastRenderedPageBreak/>
         <w:t>Use for Report:</w:t>
       </w:r>
       <w:r>
@@ -7667,6 +7713,7 @@
           <w:b/>
           <w:bCs/>
         </w:rPr>
+        <w:lastRenderedPageBreak/>
         <w:t xml:space="preserve">Key Contributions: </w:t>
       </w:r>
     </w:p>
@@ -7691,7 +7738,6 @@
         </w:numPr>
       </w:pPr>
       <w:r>
-        <w:lastRenderedPageBreak/>
         <w:t xml:space="preserve">Demonstrates a validated design flow using the </w:t>
       </w:r>
       <w:proofErr w:type="spellStart"/>
@@ -7832,6 +7878,7 @@
         <w:rPr>
           <w:color w:val="auto"/>
         </w:rPr>
+        <w:lastRenderedPageBreak/>
         <w:t>[57] Evaluation of RISC-V RTL with FPGA-Accelerated Simulation</w:t>
       </w:r>
       <w:bookmarkEnd w:id="47"/>
@@ -7872,7 +7919,6 @@
         </w:numPr>
       </w:pPr>
       <w:r>
-        <w:lastRenderedPageBreak/>
         <w:t>Introduces MIDAS, an open-source framework that automatically transforms any RISC-V RTL design into an FPGA-accelerated simulator, achieving speeds up to 1000x faster than traditional cycle-level software simulators.</w:t>
       </w:r>
     </w:p>
@@ -13076,10 +13122,6 @@
 </file>
 
 <file path=customXml/item1.xml><?xml version="1.0" encoding="utf-8"?>
-<b:Sources xmlns:b="http://schemas.openxmlformats.org/officeDocument/2006/bibliography" xmlns="http://schemas.openxmlformats.org/officeDocument/2006/bibliography" SelectedStyle="\APASixthEditionOfficeOnline.xsl" StyleName="APA" Version="6"/>
-</file>
-
-<file path=customXml/item2.xml><?xml version="1.0" encoding="utf-8"?>
 <p:properties xmlns:p="http://schemas.microsoft.com/office/2006/metadata/properties" xmlns:xsi="http://www.w3.org/2001/XMLSchema-instance" xmlns:pc="http://schemas.microsoft.com/office/infopath/2007/PartnerControls">
   <documentManagement>
     <lcf76f155ced4ddcb4097134ff3c332f xmlns="79dafb07-ed9c-45b9-bdd5-7edc6afbb844">
@@ -13090,16 +13132,11 @@
 </p:properties>
 </file>
 
-<file path=customXml/item3.xml><?xml version="1.0" encoding="utf-8"?>
-<?mso-contentType ?>
-<FormTemplates xmlns="http://schemas.microsoft.com/sharepoint/v3/contenttype/forms">
-  <Display>DocumentLibraryForm</Display>
-  <Edit>DocumentLibraryForm</Edit>
-  <New>DocumentLibraryForm</New>
-</FormTemplates>
+<file path=customXml/item2.xml><?xml version="1.0" encoding="utf-8"?>
+<b:Sources xmlns:b="http://schemas.openxmlformats.org/officeDocument/2006/bibliography" xmlns="http://schemas.openxmlformats.org/officeDocument/2006/bibliography" SelectedStyle="\APASixthEditionOfficeOnline.xsl" StyleName="APA" Version="6"/>
 </file>
 
-<file path=customXml/item4.xml><?xml version="1.0" encoding="utf-8"?>
+<file path=customXml/item3.xml><?xml version="1.0" encoding="utf-8"?>
 <ct:contentTypeSchema xmlns:ct="http://schemas.microsoft.com/office/2006/metadata/contentType" xmlns:ma="http://schemas.microsoft.com/office/2006/metadata/properties/metaAttributes" ct:_="" ma:_="" ma:contentTypeName="Document" ma:contentTypeID="0x010100327E1D6C563CDA40806F7E9B31ED6F78" ma:contentTypeVersion="10" ma:contentTypeDescription="Create a new document." ma:contentTypeScope="" ma:versionID="f1241b1609dc3db390d872b124f83cad">
   <xsd:schema xmlns:xsd="http://www.w3.org/2001/XMLSchema" xmlns:xs="http://www.w3.org/2001/XMLSchema" xmlns:p="http://schemas.microsoft.com/office/2006/metadata/properties" xmlns:ns2="79dafb07-ed9c-45b9-bdd5-7edc6afbb844" xmlns:ns3="289cb04d-cef7-4555-890d-d32a1b220da2" targetNamespace="http://schemas.microsoft.com/office/2006/metadata/properties" ma:root="true" ma:fieldsID="c50fb687558e178668646ff28360b07f" ns2:_="" ns3:_="">
     <xsd:import namespace="79dafb07-ed9c-45b9-bdd5-7edc6afbb844"/>
@@ -13288,15 +13325,16 @@
 </ct:contentTypeSchema>
 </file>
 
-<file path=customXml/itemProps1.xml><?xml version="1.0" encoding="utf-8"?>
-<ds:datastoreItem xmlns:ds="http://schemas.openxmlformats.org/officeDocument/2006/customXml" ds:itemID="{37813D10-BC31-4257-91C2-323FC15A5009}">
-  <ds:schemaRefs>
-    <ds:schemaRef ds:uri="http://schemas.openxmlformats.org/officeDocument/2006/bibliography"/>
-  </ds:schemaRefs>
-</ds:datastoreItem>
+<file path=customXml/item4.xml><?xml version="1.0" encoding="utf-8"?>
+<?mso-contentType ?>
+<FormTemplates xmlns="http://schemas.microsoft.com/sharepoint/v3/contenttype/forms">
+  <Display>DocumentLibraryForm</Display>
+  <Edit>DocumentLibraryForm</Edit>
+  <New>DocumentLibraryForm</New>
+</FormTemplates>
 </file>
 
-<file path=customXml/itemProps2.xml><?xml version="1.0" encoding="utf-8"?>
+<file path=customXml/itemProps1.xml><?xml version="1.0" encoding="utf-8"?>
 <ds:datastoreItem xmlns:ds="http://schemas.openxmlformats.org/officeDocument/2006/customXml" ds:itemID="{1A6301B2-5529-47F7-B345-19B07BF54E9D}">
   <ds:schemaRefs>
     <ds:schemaRef ds:uri="http://schemas.microsoft.com/office/2006/metadata/properties"/>
@@ -13307,15 +13345,15 @@
 </ds:datastoreItem>
 </file>
 
-<file path=customXml/itemProps3.xml><?xml version="1.0" encoding="utf-8"?>
-<ds:datastoreItem xmlns:ds="http://schemas.openxmlformats.org/officeDocument/2006/customXml" ds:itemID="{3637BEEB-AF46-4D76-A3D5-0ECE427B0F04}">
+<file path=customXml/itemProps2.xml><?xml version="1.0" encoding="utf-8"?>
+<ds:datastoreItem xmlns:ds="http://schemas.openxmlformats.org/officeDocument/2006/customXml" ds:itemID="{37813D10-BC31-4257-91C2-323FC15A5009}">
   <ds:schemaRefs>
-    <ds:schemaRef ds:uri="http://schemas.microsoft.com/sharepoint/v3/contenttype/forms"/>
+    <ds:schemaRef ds:uri="http://schemas.openxmlformats.org/officeDocument/2006/bibliography"/>
   </ds:schemaRefs>
 </ds:datastoreItem>
 </file>
 
-<file path=customXml/itemProps4.xml><?xml version="1.0" encoding="utf-8"?>
+<file path=customXml/itemProps3.xml><?xml version="1.0" encoding="utf-8"?>
 <ds:datastoreItem xmlns:ds="http://schemas.openxmlformats.org/officeDocument/2006/customXml" ds:itemID="{F31D17BA-B1EC-491E-816B-80EBE24E111E}">
   <ds:schemaRefs>
     <ds:schemaRef ds:uri="http://schemas.microsoft.com/office/2006/metadata/contentType"/>
@@ -13332,4 +13370,12 @@
     <ds:schemaRef ds:uri="http://schemas.microsoft.com/internal/obd"/>
   </ds:schemaRefs>
 </ds:datastoreItem>
+</file>
+
+<file path=customXml/itemProps4.xml><?xml version="1.0" encoding="utf-8"?>
+<ds:datastoreItem xmlns:ds="http://schemas.openxmlformats.org/officeDocument/2006/customXml" ds:itemID="{3637BEEB-AF46-4D76-A3D5-0ECE427B0F04}">
+  <ds:schemaRefs>
+    <ds:schemaRef ds:uri="http://schemas.microsoft.com/sharepoint/v3/contenttype/forms"/>
+  </ds:schemaRefs>
+</ds:datastoreItem>
 </file>
</xml_diff>